<commit_message>
Resume: Information Security Analyst @ GoTo (unknown)
</commit_message>
<xml_diff>
--- a/resumes/Resume_Information_Security_Analyst_GoTo__unknown_.docx
+++ b/resumes/Resume_Information_Security_Analyst_GoTo__unknown_.docx
@@ -412,7 +412,7 @@
           <w:sz w:val="19"/>
           <w:szCs w:val="19"/>
         </w:rPr>
-        <w:t>Triaged 50+ weekly inventory reimbursement cases by severity and policy eligibility, mirroring the structured alert triage and escalation workflow used in SOC Tier 1 analyst roles.</w:t>
+        <w:t>Triaged 50+ weekly inventory reimbursement cases by severity and policy eligibility, mirroring the structured alert triage and escalation workflow used in information security analyst roles.</w:t>
       </w:r>
       <w:proofErr w:type="spellStart"/>
       <w:r>
@@ -449,7 +449,7 @@
           <w:sz w:val="19"/>
           <w:szCs w:val="19"/>
         </w:rPr>
-        <w:t>Performed root cause analysis on seller claims to identify policy violations and anomalous patterns; escalated findings to senior reviewers, demonstrating investigative instincts central to SOC and fraud analyst operations.</w:t>
+        <w:t>Performed root cause analysis on seller claims to identify policy violations and anomalous patterns; escalated findings to senior reviewers, demonstrating investigative instincts central to security and fraud analyst operations.</w:t>
       </w:r>
     </w:p>
     <w:p>

</xml_diff>